<commit_message>
Update oq_hmi_service.py and VI 10 machine HMI documents
</commit_message>
<xml_diff>
--- a/IQOQDQ/OQ_HMI/Machine type/VI 10/View_MoreView_SetupRobotView_Tab_1.docx
+++ b/IQOQDQ/OQ_HMI/Machine type/VI 10/View_MoreView_SetupRobotView_Tab_1.docx
@@ -107,34 +107,47 @@
                 <w:noProof/>
               </w:rPr>
               <w:drawing>
-                <wp:inline distT="0" distB="0" distL="0" distR="0" wp14:anchorId="3B6C7FFB" wp14:editId="4C769D52">
-                  <wp:extent cx="5985956" cy="3364991"/>
-                  <wp:effectExtent l="0" t="0" r="0" b="0"/>
-                  <wp:docPr id="44" name="Image 44"/>
+                <wp:inline distT="0" distB="0" distL="0" distR="0" wp14:anchorId="2C8C758F" wp14:editId="6B480524">
+                  <wp:extent cx="5972175" cy="3357880"/>
+                  <wp:effectExtent l="0" t="0" r="9525" b="0"/>
+                  <wp:docPr id="951344484" name="Picture 1"/>
                   <wp:cNvGraphicFramePr>
-                    <a:graphicFrameLocks xmlns:a="http://schemas.openxmlformats.org/drawingml/2006/main"/>
+                    <a:graphicFrameLocks xmlns:a="http://schemas.openxmlformats.org/drawingml/2006/main" noChangeAspect="1"/>
                   </wp:cNvGraphicFramePr>
                   <a:graphic xmlns:a="http://schemas.openxmlformats.org/drawingml/2006/main">
                     <a:graphicData uri="http://schemas.openxmlformats.org/drawingml/2006/picture">
                       <pic:pic xmlns:pic="http://schemas.openxmlformats.org/drawingml/2006/picture">
                         <pic:nvPicPr>
-                          <pic:cNvPr id="44" name="Image 44"/>
-                          <pic:cNvPicPr/>
+                          <pic:cNvPr id="0" name="Picture 1"/>
+                          <pic:cNvPicPr>
+                            <a:picLocks noChangeAspect="1" noChangeArrowheads="1"/>
+                          </pic:cNvPicPr>
                         </pic:nvPicPr>
                         <pic:blipFill>
-                          <a:blip r:embed="rId5" cstate="print"/>
+                          <a:blip r:embed="rId5">
+                            <a:extLst>
+                              <a:ext uri="{28A0092B-C50C-407E-A947-70E740481C1C}">
+                                <a14:useLocalDpi xmlns:a14="http://schemas.microsoft.com/office/drawing/2010/main" val="0"/>
+                              </a:ext>
+                            </a:extLst>
+                          </a:blip>
+                          <a:srcRect/>
                           <a:stretch>
                             <a:fillRect/>
                           </a:stretch>
                         </pic:blipFill>
-                        <pic:spPr>
+                        <pic:spPr bwMode="auto">
                           <a:xfrm>
                             <a:off x="0" y="0"/>
-                            <a:ext cx="5985956" cy="3364991"/>
+                            <a:ext cx="5972175" cy="3357880"/>
                           </a:xfrm>
                           <a:prstGeom prst="rect">
                             <a:avLst/>
                           </a:prstGeom>
+                          <a:noFill/>
+                          <a:ln>
+                            <a:noFill/>
+                          </a:ln>
                         </pic:spPr>
                       </pic:pic>
                     </a:graphicData>
@@ -458,6 +471,7 @@
               <w:right w:val="single" w:sz="4" w:space="0" w:color="auto"/>
             </w:tcBorders>
             <w:noWrap/>
+            <w:vAlign w:val="center"/>
           </w:tcPr>
           <w:p>
             <w:pPr>
@@ -474,67 +488,7 @@
                 <w:bCs/>
                 <w:lang w:val="en-US"/>
               </w:rPr>
-              <w:t>Holding</w:t>
-            </w:r>
-            <w:r>
-              <w:rPr>
-                <w:b w:val="0"/>
-                <w:bCs/>
-                <w:spacing w:val="-14"/>
-                <w:lang w:val="en-US"/>
-              </w:rPr>
-              <w:t xml:space="preserve"> </w:t>
-            </w:r>
-            <w:r>
-              <w:rPr>
-                <w:b w:val="0"/>
-                <w:bCs/>
-                <w:lang w:val="en-US"/>
-              </w:rPr>
-              <w:t>time</w:t>
-            </w:r>
-            <w:r>
-              <w:rPr>
-                <w:b w:val="0"/>
-                <w:bCs/>
-                <w:spacing w:val="-14"/>
-                <w:lang w:val="en-US"/>
-              </w:rPr>
-              <w:t xml:space="preserve"> </w:t>
-            </w:r>
-            <w:r>
-              <w:rPr>
-                <w:b w:val="0"/>
-                <w:bCs/>
-                <w:lang w:val="en-US"/>
-              </w:rPr>
-              <w:t>during</w:t>
-            </w:r>
-            <w:r>
-              <w:rPr>
-                <w:b w:val="0"/>
-                <w:bCs/>
-                <w:spacing w:val="-14"/>
-                <w:lang w:val="en-US"/>
-              </w:rPr>
-              <w:t xml:space="preserve"> </w:t>
-            </w:r>
-            <w:r>
-              <w:rPr>
-                <w:b w:val="0"/>
-                <w:bCs/>
-                <w:lang w:val="en-US"/>
-              </w:rPr>
-              <w:t xml:space="preserve">product </w:t>
-            </w:r>
-            <w:r>
-              <w:rPr>
-                <w:b w:val="0"/>
-                <w:bCs/>
-                <w:spacing w:val="-2"/>
-                <w:lang w:val="en-US"/>
-              </w:rPr>
-              <w:t>pick-up</w:t>
+              <w:t>Robot Speed</w:t>
             </w:r>
           </w:p>
         </w:tc>
@@ -547,37 +501,21 @@
               <w:bottom w:val="single" w:sz="4" w:space="0" w:color="auto"/>
               <w:right w:val="single" w:sz="4" w:space="0" w:color="auto"/>
             </w:tcBorders>
-          </w:tcPr>
-          <w:p>
-            <w:pPr>
-              <w:rPr>
-                <w:rFonts w:cs="Arial"/>
-                <w:szCs w:val="20"/>
-              </w:rPr>
-            </w:pPr>
-            <w:r>
-              <w:t>0</w:t>
-            </w:r>
-            <w:r>
-              <w:rPr>
-                <w:spacing w:val="-3"/>
-              </w:rPr>
-              <w:t xml:space="preserve"> </w:t>
-            </w:r>
-            <w:r>
-              <w:t>…</w:t>
-            </w:r>
-            <w:r>
-              <w:rPr>
-                <w:spacing w:val="-3"/>
-              </w:rPr>
-              <w:t xml:space="preserve"> </w:t>
-            </w:r>
-            <w:r>
-              <w:rPr>
-                <w:spacing w:val="-5"/>
-              </w:rPr>
-              <w:t>200</w:t>
+            <w:vAlign w:val="center"/>
+          </w:tcPr>
+          <w:p>
+            <w:pPr>
+              <w:rPr>
+                <w:rFonts w:cs="Arial"/>
+                <w:szCs w:val="20"/>
+              </w:rPr>
+            </w:pPr>
+            <w:r>
+              <w:rPr>
+                <w:rFonts w:cs="Arial"/>
+                <w:szCs w:val="20"/>
+              </w:rPr>
+              <w:t>10…35</w:t>
             </w:r>
           </w:p>
         </w:tc>
@@ -654,12 +592,13 @@
           <w:tcPr>
             <w:tcW w:w="2886" w:type="dxa"/>
             <w:tcBorders>
-              <w:top w:val="single" w:sz="4" w:space="0" w:color="auto"/>
+              <w:top w:val="nil"/>
               <w:left w:val="single" w:sz="4" w:space="0" w:color="auto"/>
               <w:bottom w:val="single" w:sz="4" w:space="0" w:color="auto"/>
               <w:right w:val="single" w:sz="4" w:space="0" w:color="auto"/>
             </w:tcBorders>
             <w:noWrap/>
+            <w:vAlign w:val="center"/>
           </w:tcPr>
           <w:p>
             <w:pPr>
@@ -676,67 +615,270 @@
                 <w:bCs/>
                 <w:lang w:val="en-US"/>
               </w:rPr>
-              <w:t>Holding</w:t>
-            </w:r>
-            <w:r>
-              <w:rPr>
-                <w:b w:val="0"/>
-                <w:bCs/>
-                <w:spacing w:val="-14"/>
-                <w:lang w:val="en-US"/>
-              </w:rPr>
-              <w:t xml:space="preserve"> </w:t>
-            </w:r>
-            <w:r>
+              <w:t>Additional Placing Time</w:t>
+            </w:r>
+          </w:p>
+        </w:tc>
+        <w:tc>
+          <w:tcPr>
+            <w:tcW w:w="1619" w:type="dxa"/>
+            <w:tcBorders>
+              <w:top w:val="nil"/>
+              <w:left w:val="nil"/>
+              <w:bottom w:val="single" w:sz="4" w:space="0" w:color="auto"/>
+              <w:right w:val="single" w:sz="4" w:space="0" w:color="auto"/>
+            </w:tcBorders>
+            <w:vAlign w:val="center"/>
+          </w:tcPr>
+          <w:p>
+            <w:pPr>
+              <w:rPr>
+                <w:rFonts w:cs="Arial"/>
+                <w:szCs w:val="20"/>
+              </w:rPr>
+            </w:pPr>
+            <w:r>
+              <w:rPr>
+                <w:rFonts w:cs="Arial"/>
+                <w:szCs w:val="20"/>
+              </w:rPr>
+              <w:t>0.00…5000.00</w:t>
+            </w:r>
+          </w:p>
+        </w:tc>
+        <w:tc>
+          <w:tcPr>
+            <w:tcW w:w="1619" w:type="dxa"/>
+            <w:tcBorders>
+              <w:top w:val="nil"/>
+              <w:left w:val="nil"/>
+              <w:bottom w:val="single" w:sz="4" w:space="0" w:color="auto"/>
+              <w:right w:val="single" w:sz="4" w:space="0" w:color="auto"/>
+            </w:tcBorders>
+            <w:noWrap/>
+            <w:vAlign w:val="center"/>
+          </w:tcPr>
+          <w:p>
+            <w:pPr>
+              <w:rPr>
+                <w:rFonts w:cs="Arial"/>
+                <w:szCs w:val="20"/>
+              </w:rPr>
+            </w:pPr>
+          </w:p>
+        </w:tc>
+        <w:tc>
+          <w:tcPr>
+            <w:tcW w:w="1798" w:type="dxa"/>
+            <w:tcBorders>
+              <w:top w:val="nil"/>
+              <w:left w:val="nil"/>
+              <w:bottom w:val="single" w:sz="4" w:space="0" w:color="auto"/>
+              <w:right w:val="single" w:sz="4" w:space="0" w:color="auto"/>
+            </w:tcBorders>
+            <w:noWrap/>
+            <w:vAlign w:val="center"/>
+          </w:tcPr>
+          <w:p>
+            <w:pPr>
+              <w:rPr>
+                <w:rFonts w:cs="Arial"/>
+                <w:szCs w:val="20"/>
+              </w:rPr>
+            </w:pPr>
+          </w:p>
+        </w:tc>
+        <w:tc>
+          <w:tcPr>
+            <w:tcW w:w="1623" w:type="dxa"/>
+            <w:tcBorders>
+              <w:top w:val="nil"/>
+              <w:left w:val="nil"/>
+              <w:bottom w:val="single" w:sz="4" w:space="0" w:color="auto"/>
+              <w:right w:val="single" w:sz="4" w:space="0" w:color="auto"/>
+            </w:tcBorders>
+            <w:noWrap/>
+            <w:vAlign w:val="center"/>
+          </w:tcPr>
+          <w:p>
+            <w:pPr>
+              <w:rPr>
+                <w:rFonts w:cs="Arial"/>
+                <w:szCs w:val="20"/>
+              </w:rPr>
+            </w:pPr>
+          </w:p>
+        </w:tc>
+      </w:tr>
+      <w:tr>
+        <w:trPr>
+          <w:cantSplit/>
+          <w:trHeight w:val="426"/>
+        </w:trPr>
+        <w:tc>
+          <w:tcPr>
+            <w:tcW w:w="2886" w:type="dxa"/>
+            <w:tcBorders>
+              <w:top w:val="nil"/>
+              <w:left w:val="single" w:sz="4" w:space="0" w:color="auto"/>
+              <w:bottom w:val="single" w:sz="4" w:space="0" w:color="auto"/>
+              <w:right w:val="single" w:sz="4" w:space="0" w:color="auto"/>
+            </w:tcBorders>
+            <w:noWrap/>
+            <w:vAlign w:val="center"/>
+          </w:tcPr>
+          <w:p>
+            <w:pPr>
+              <w:pStyle w:val="Testnummer"/>
               <w:rPr>
                 <w:b w:val="0"/>
                 <w:bCs/>
                 <w:lang w:val="en-US"/>
               </w:rPr>
-              <w:t>time</w:t>
-            </w:r>
-            <w:r>
-              <w:rPr>
-                <w:b w:val="0"/>
-                <w:bCs/>
-                <w:spacing w:val="-14"/>
-                <w:lang w:val="en-US"/>
-              </w:rPr>
-              <w:t xml:space="preserve"> </w:t>
-            </w:r>
+            </w:pPr>
+            <w:proofErr w:type="spellStart"/>
             <w:r>
               <w:rPr>
                 <w:b w:val="0"/>
                 <w:bCs/>
                 <w:lang w:val="en-US"/>
               </w:rPr>
-              <w:t>during</w:t>
-            </w:r>
-            <w:r>
-              <w:rPr>
-                <w:b w:val="0"/>
-                <w:bCs/>
-                <w:spacing w:val="-14"/>
-                <w:lang w:val="en-US"/>
-              </w:rPr>
-              <w:t xml:space="preserve"> </w:t>
-            </w:r>
+              <w:t>Prerun</w:t>
+            </w:r>
+            <w:proofErr w:type="spellEnd"/>
             <w:r>
               <w:rPr>
                 <w:b w:val="0"/>
                 <w:bCs/>
                 <w:lang w:val="en-US"/>
               </w:rPr>
-              <w:t xml:space="preserve">product </w:t>
-            </w:r>
-            <w:r>
+              <w:t xml:space="preserve"> Correction Vacuum Off</w:t>
+            </w:r>
+          </w:p>
+        </w:tc>
+        <w:tc>
+          <w:tcPr>
+            <w:tcW w:w="1619" w:type="dxa"/>
+            <w:tcBorders>
+              <w:top w:val="nil"/>
+              <w:left w:val="nil"/>
+              <w:bottom w:val="single" w:sz="4" w:space="0" w:color="auto"/>
+              <w:right w:val="single" w:sz="4" w:space="0" w:color="auto"/>
+            </w:tcBorders>
+            <w:vAlign w:val="center"/>
+          </w:tcPr>
+          <w:p>
+            <w:pPr>
+              <w:rPr>
+                <w:rFonts w:cs="Arial"/>
+                <w:szCs w:val="20"/>
+              </w:rPr>
+            </w:pPr>
+            <w:r>
+              <w:rPr>
+                <w:rFonts w:cs="Arial"/>
+                <w:szCs w:val="20"/>
+              </w:rPr>
+              <w:t>0.00…50.00</w:t>
+            </w:r>
+          </w:p>
+        </w:tc>
+        <w:tc>
+          <w:tcPr>
+            <w:tcW w:w="1619" w:type="dxa"/>
+            <w:tcBorders>
+              <w:top w:val="nil"/>
+              <w:left w:val="nil"/>
+              <w:bottom w:val="single" w:sz="4" w:space="0" w:color="auto"/>
+              <w:right w:val="single" w:sz="4" w:space="0" w:color="auto"/>
+            </w:tcBorders>
+            <w:noWrap/>
+            <w:vAlign w:val="center"/>
+          </w:tcPr>
+          <w:p>
+            <w:pPr>
+              <w:rPr>
+                <w:rFonts w:cs="Arial"/>
+                <w:szCs w:val="20"/>
+              </w:rPr>
+            </w:pPr>
+          </w:p>
+        </w:tc>
+        <w:tc>
+          <w:tcPr>
+            <w:tcW w:w="1798" w:type="dxa"/>
+            <w:tcBorders>
+              <w:top w:val="nil"/>
+              <w:left w:val="nil"/>
+              <w:bottom w:val="single" w:sz="4" w:space="0" w:color="auto"/>
+              <w:right w:val="single" w:sz="4" w:space="0" w:color="auto"/>
+            </w:tcBorders>
+            <w:noWrap/>
+            <w:vAlign w:val="center"/>
+          </w:tcPr>
+          <w:p>
+            <w:pPr>
+              <w:rPr>
+                <w:rFonts w:cs="Arial"/>
+                <w:szCs w:val="20"/>
+              </w:rPr>
+            </w:pPr>
+          </w:p>
+        </w:tc>
+        <w:tc>
+          <w:tcPr>
+            <w:tcW w:w="1623" w:type="dxa"/>
+            <w:tcBorders>
+              <w:top w:val="nil"/>
+              <w:left w:val="nil"/>
+              <w:bottom w:val="single" w:sz="4" w:space="0" w:color="auto"/>
+              <w:right w:val="single" w:sz="4" w:space="0" w:color="auto"/>
+            </w:tcBorders>
+            <w:noWrap/>
+            <w:vAlign w:val="center"/>
+          </w:tcPr>
+          <w:p>
+            <w:pPr>
+              <w:rPr>
+                <w:rFonts w:cs="Arial"/>
+                <w:szCs w:val="20"/>
+              </w:rPr>
+            </w:pPr>
+          </w:p>
+        </w:tc>
+      </w:tr>
+      <w:tr>
+        <w:trPr>
+          <w:cantSplit/>
+          <w:trHeight w:val="426"/>
+        </w:trPr>
+        <w:tc>
+          <w:tcPr>
+            <w:tcW w:w="2886" w:type="dxa"/>
+            <w:tcBorders>
+              <w:top w:val="nil"/>
+              <w:left w:val="single" w:sz="4" w:space="0" w:color="auto"/>
+              <w:bottom w:val="single" w:sz="4" w:space="0" w:color="auto"/>
+              <w:right w:val="single" w:sz="4" w:space="0" w:color="auto"/>
+            </w:tcBorders>
+            <w:noWrap/>
+          </w:tcPr>
+          <w:p>
+            <w:pPr>
+              <w:pStyle w:val="Testnummer"/>
               <w:rPr>
                 <w:b w:val="0"/>
                 <w:bCs/>
-                <w:spacing w:val="-2"/>
                 <w:lang w:val="en-US"/>
               </w:rPr>
-              <w:t>placement</w:t>
+            </w:pPr>
+            <w:r>
+              <w:rPr>
+                <w:b w:val="0"/>
+                <w:bCs/>
+                <w:lang w:val="en-US"/>
+              </w:rPr>
+              <w:t>Holding Time During Product Pick-Up</w:t>
             </w:r>
           </w:p>
         </w:tc>
@@ -744,7 +886,155 @@
           <w:tcPr>
             <w:tcW w:w="1619" w:type="dxa"/>
             <w:tcBorders>
+              <w:top w:val="nil"/>
+              <w:left w:val="nil"/>
+              <w:bottom w:val="single" w:sz="4" w:space="0" w:color="auto"/>
+              <w:right w:val="single" w:sz="4" w:space="0" w:color="auto"/>
+            </w:tcBorders>
+          </w:tcPr>
+          <w:p>
+            <w:pPr>
+              <w:rPr>
+                <w:rFonts w:cs="Arial"/>
+                <w:szCs w:val="20"/>
+              </w:rPr>
+            </w:pPr>
+            <w:r>
+              <w:t>0</w:t>
+            </w:r>
+            <w:r>
+              <w:rPr>
+                <w:spacing w:val="-3"/>
+              </w:rPr>
+              <w:t xml:space="preserve"> </w:t>
+            </w:r>
+            <w:r>
+              <w:t>…</w:t>
+            </w:r>
+            <w:r>
+              <w:rPr>
+                <w:spacing w:val="-3"/>
+              </w:rPr>
+              <w:t xml:space="preserve"> </w:t>
+            </w:r>
+            <w:r>
+              <w:rPr>
+                <w:spacing w:val="-5"/>
+              </w:rPr>
+              <w:t>10</w:t>
+            </w:r>
+            <w:r>
+              <w:rPr>
+                <w:spacing w:val="-5"/>
+              </w:rPr>
+              <w:t>00</w:t>
+            </w:r>
+          </w:p>
+        </w:tc>
+        <w:tc>
+          <w:tcPr>
+            <w:tcW w:w="1619" w:type="dxa"/>
+            <w:tcBorders>
+              <w:top w:val="nil"/>
+              <w:left w:val="nil"/>
+              <w:bottom w:val="single" w:sz="4" w:space="0" w:color="auto"/>
+              <w:right w:val="single" w:sz="4" w:space="0" w:color="auto"/>
+            </w:tcBorders>
+            <w:noWrap/>
+            <w:vAlign w:val="center"/>
+          </w:tcPr>
+          <w:p>
+            <w:pPr>
+              <w:rPr>
+                <w:rFonts w:cs="Arial"/>
+                <w:szCs w:val="20"/>
+              </w:rPr>
+            </w:pPr>
+          </w:p>
+        </w:tc>
+        <w:tc>
+          <w:tcPr>
+            <w:tcW w:w="1798" w:type="dxa"/>
+            <w:tcBorders>
+              <w:top w:val="nil"/>
+              <w:left w:val="nil"/>
+              <w:bottom w:val="single" w:sz="4" w:space="0" w:color="auto"/>
+              <w:right w:val="single" w:sz="4" w:space="0" w:color="auto"/>
+            </w:tcBorders>
+            <w:noWrap/>
+            <w:vAlign w:val="center"/>
+          </w:tcPr>
+          <w:p>
+            <w:pPr>
+              <w:rPr>
+                <w:rFonts w:cs="Arial"/>
+                <w:szCs w:val="20"/>
+              </w:rPr>
+            </w:pPr>
+          </w:p>
+        </w:tc>
+        <w:tc>
+          <w:tcPr>
+            <w:tcW w:w="1623" w:type="dxa"/>
+            <w:tcBorders>
+              <w:top w:val="nil"/>
+              <w:left w:val="nil"/>
+              <w:bottom w:val="single" w:sz="4" w:space="0" w:color="auto"/>
+              <w:right w:val="single" w:sz="4" w:space="0" w:color="auto"/>
+            </w:tcBorders>
+            <w:noWrap/>
+            <w:vAlign w:val="center"/>
+          </w:tcPr>
+          <w:p>
+            <w:pPr>
+              <w:rPr>
+                <w:rFonts w:cs="Arial"/>
+                <w:szCs w:val="20"/>
+              </w:rPr>
+            </w:pPr>
+          </w:p>
+        </w:tc>
+      </w:tr>
+      <w:tr>
+        <w:trPr>
+          <w:cantSplit/>
+          <w:trHeight w:val="426"/>
+        </w:trPr>
+        <w:tc>
+          <w:tcPr>
+            <w:tcW w:w="2886" w:type="dxa"/>
+            <w:tcBorders>
               <w:top w:val="single" w:sz="4" w:space="0" w:color="auto"/>
+              <w:left w:val="single" w:sz="4" w:space="0" w:color="auto"/>
+              <w:bottom w:val="single" w:sz="4" w:space="0" w:color="auto"/>
+              <w:right w:val="single" w:sz="4" w:space="0" w:color="auto"/>
+            </w:tcBorders>
+            <w:noWrap/>
+          </w:tcPr>
+          <w:p>
+            <w:pPr>
+              <w:pStyle w:val="Testnummer"/>
+              <w:rPr>
+                <w:b w:val="0"/>
+                <w:bCs/>
+                <w:lang w:val="en-US"/>
+              </w:rPr>
+            </w:pPr>
+            <w:r>
+              <w:rPr>
+                <w:b w:val="0"/>
+                <w:bCs/>
+                <w:lang w:val="en-US"/>
+              </w:rPr>
+              <w:t>Holding Time During Product Placement</w:t>
+            </w:r>
+          </w:p>
+        </w:tc>
+        <w:tc>
+          <w:tcPr>
+            <w:tcW w:w="1619" w:type="dxa"/>
+            <w:tcBorders>
+              <w:top w:val="single" w:sz="4" w:space="0" w:color="auto"/>
               <w:left w:val="nil"/>
               <w:bottom w:val="single" w:sz="4" w:space="0" w:color="auto"/>
               <w:right w:val="single" w:sz="4" w:space="0" w:color="auto"/>
@@ -779,7 +1069,7 @@
               <w:rPr>
                 <w:spacing w:val="-5"/>
               </w:rPr>
-              <w:t>200</w:t>
+              <w:t>1000</w:t>
             </w:r>
           </w:p>
         </w:tc>

</xml_diff>